<commit_message>
Extend each slide script with one more line
Co-Authored-By: Claude Opus 5.5 <noreply@anthropic.com>
Claude-Session: https://claude.ai/code/session_01Uqp9YeW6XJWfxNpY8bKv2R
</commit_message>
<xml_diff>
--- a/Guion_Caso_Hermosilla.docx
+++ b/Guion_Caso_Hermosilla.docx
@@ -39,7 +39,7 @@
         <w:spacing w:after="120" w:line="300"/>
       </w:pPr>
       <w:r>
-        <w:t xml:space="preserve">En noviembre de 2023 se conoció un audio. En él, el abogado Luis Hermosilla proponía sobornar a funcionarios del SII y la CMF para obtener información sobre la investigación a Daniel Sauer, dueño de Factop y STF Capital. Factop emitió casi 10.000 facturas falsas. Además, la CMF sancionó a STF Capital y el SII presentó una querella en su contra.</w:t>
+        <w:t xml:space="preserve">En noviembre de 2023 se conoció un audio. En él, el abogado Luis Hermosilla proponía sobornar a funcionarios del SII y la CMF para obtener información sobre la investigación a Daniel Sauer, dueño de Factop y STF Capital. Factop emitió casi 10.000 facturas falsas. Además, la CMF sancionó a STF Capital y el SII presentó una querella en su contra. Este caso muestra cómo decisiones individuales pueden dañar la confianza en todo el sistema financiero.</w:t>
       </w:r>
     </w:p>
     <w:p>
@@ -56,7 +56,7 @@
         <w:spacing w:after="120" w:line="300"/>
       </w:pPr>
       <w:r>
-        <w:t xml:space="preserve">El bien común se genera cuando cada profesional hace bien su trabajo y cuida la confianza en el sistema. Aquí los involucrados pusieron su beneficio privado primero y dañaron a inversionistas, contribuyentes y al mercado.</w:t>
+        <w:t xml:space="preserve">El bien común se genera cuando cada profesional hace bien su trabajo y cuida la confianza en el sistema. Aquí los involucrados pusieron su beneficio privado primero y dañaron a inversionistas, contribuyentes y al mercado. El fraude transformó un trabajo que debía aportar a la sociedad en una fuente de daño.</w:t>
       </w:r>
     </w:p>
     <w:p>
@@ -73,7 +73,7 @@
         <w:spacing w:after="120" w:line="300"/>
       </w:pPr>
       <w:r>
-        <w:t xml:space="preserve">El carácter se forma con cada decisión. Los sobornos y las facturas falsas repetidos muestran un carácter que se fue deteriorando. Actuar mal daña a otros y también a quien lo hace.</w:t>
+        <w:t xml:space="preserve">El carácter se forma con cada decisión. Los sobornos y las facturas falsas repetidos muestran un carácter que se fue deteriorando. Actuar mal daña a otros y también a quien lo hace. Con el tiempo, lo que parecía una excepción terminó convirtiéndose en costumbre.</w:t>
       </w:r>
     </w:p>
     <w:p>
@@ -90,7 +90,7 @@
         <w:spacing w:after="120" w:line="300"/>
       </w:pPr>
       <w:r>
-        <w:t xml:space="preserve">Somos responsables de lo que hacemos con conocimiento y libertad. Los involucrados sabían que sus actos eran ilegales, así que su responsabilidad es plena y no tiene atenuantes.</w:t>
+        <w:t xml:space="preserve">Somos responsables de lo que hacemos con conocimiento y libertad. Los involucrados sabían que sus actos eran ilegales, así que su responsabilidad es plena y no tiene atenuantes. Conocer el bien y aun así elegir el mal agrava la falta, en vez de disminuirla.</w:t>
       </w:r>
     </w:p>
     <w:p>
@@ -107,7 +107,7 @@
         <w:spacing w:after="120" w:line="300"/>
       </w:pPr>
       <w:r>
-        <w:t xml:space="preserve">La ética abarca toda la vida, no solo el trabajo. No existe una “ética de oficina”: quien actúa mal en el trabajo, actúa mal como persona. En este caso, esas decisiones dañaron tanto su carrera como su integridad.</w:t>
+        <w:t xml:space="preserve">La ética abarca toda la vida, no solo el trabajo. No existe una “ética de oficina”: quien actúa mal en el trabajo, actúa mal como persona. En este caso, esas decisiones dañaron tanto su carrera como su integridad. La coherencia entre lo que somos y lo que hacemos es la base de un buen profesional.</w:t>
       </w:r>
     </w:p>
     <w:p>
@@ -124,7 +124,7 @@
         <w:spacing w:after="120" w:line="300"/>
       </w:pPr>
       <w:r>
-        <w:t xml:space="preserve">Los involucrados eligieron “tener más” en vez de “ser más”. Como futuros profesionales de finanzas, debemos actuar con prudencia y verdad, aunque eso tenga un costo. Muchas gracias.</w:t>
+        <w:t xml:space="preserve">Los involucrados eligieron “tener más” en vez de “ser más”. Como futuros profesionales de finanzas, debemos actuar con prudencia y verdad, aunque eso tenga un costo. La verdadera excelencia profesional no se mide solo por los resultados, sino por la forma en que se logran. Muchas gracias.</w:t>
       </w:r>
     </w:p>
     <w:sectPr>

</xml_diff>